<commit_message>
ajustados hallazgos de repositorio
</commit_message>
<xml_diff>
--- a/fuentes/CFA2_135333_DU.docx
+++ b/fuentes/CFA2_135333_DU.docx
@@ -2486,7 +2486,7 @@
           <w:noProof/>
         </w:rPr>
         <w:drawing>
-          <wp:inline distT="0" distB="0" distL="0" distR="0" wp14:anchorId="09946900" wp14:editId="7DCB17DC">
+          <wp:inline distT="0" distB="0" distL="0" distR="0" wp14:anchorId="09946900" wp14:editId="284CAE74">
             <wp:extent cx="4559235" cy="2564569"/>
             <wp:effectExtent l="0" t="0" r="0" b="7620"/>
             <wp:docPr id="245925050" name="Imagen 4">
@@ -2810,6 +2810,7 @@
         </w:rPr>
         <w:t xml:space="preserve">Los </w:t>
       </w:r>
+      <w:proofErr w:type="spellStart"/>
       <w:r>
         <w:rPr>
           <w:rStyle w:val="Extranjerismo"/>
@@ -2817,6 +2818,7 @@
         </w:rPr>
         <w:t>millennials</w:t>
       </w:r>
+      <w:proofErr w:type="spellEnd"/>
       <w:r>
         <w:rPr>
           <w:rFonts w:ascii="Calibri" w:hAnsi="Calibri" w:cs="Calibri"/>
@@ -2974,9 +2976,9 @@
           <w:noProof/>
         </w:rPr>
         <w:drawing>
-          <wp:inline distT="0" distB="0" distL="0" distR="0" wp14:anchorId="5CE23613" wp14:editId="1A77B799">
-            <wp:extent cx="4466764" cy="2512554"/>
-            <wp:effectExtent l="0" t="0" r="0" b="2540"/>
+          <wp:inline distT="0" distB="0" distL="0" distR="0" wp14:anchorId="5CE23613" wp14:editId="06A94F1D">
+            <wp:extent cx="4679998" cy="2632499"/>
+            <wp:effectExtent l="0" t="0" r="6350" b="0"/>
             <wp:docPr id="1057223972" name="Imagen 5">
               <a:extLst xmlns:a="http://schemas.openxmlformats.org/drawingml/2006/main">
                 <a:ext uri="{C183D7F6-B498-43B3-948B-1728B52AA6E4}">
@@ -3017,7 +3019,7 @@
                   <pic:spPr bwMode="auto">
                     <a:xfrm>
                       <a:off x="0" y="0"/>
-                      <a:ext cx="4466764" cy="2512554"/>
+                      <a:ext cx="4679998" cy="2632499"/>
                     </a:xfrm>
                     <a:prstGeom prst="rect">
                       <a:avLst/>
@@ -3103,45 +3105,43 @@
           </w:tcPr>
           <w:p>
             <w:pPr>
-              <w:pStyle w:val="Video"/>
-              <w:numPr>
-                <w:ilvl w:val="0"/>
-                <w:numId w:val="0"/>
-              </w:numPr>
-              <w:ind w:left="306"/>
-              <w:jc w:val="left"/>
               <w:rPr>
                 <w:b/>
-                <w:lang w:val="es-419"/>
-              </w:rPr>
-            </w:pPr>
-            <w:r>
-              <w:rPr>
-                <w:b/>
-                <w:lang w:val="es-419"/>
-              </w:rPr>
-              <w:t>Transcripción</w:t>
-            </w:r>
-            <w:r>
-              <w:rPr>
-                <w:b/>
-                <w:lang w:val="es-419"/>
-              </w:rPr>
-              <w:t xml:space="preserve"> del video:</w:t>
-            </w:r>
-            <w:r>
-              <w:rPr>
-                <w:b/>
-                <w:lang w:val="es-419"/>
-              </w:rPr>
-              <w:t xml:space="preserve"> </w:t>
-            </w:r>
-            <w:r>
-              <w:rPr>
                 <w:bCs/>
                 <w:lang w:val="es-419"/>
               </w:rPr>
-              <w:t>Características de un sistema eficaz de atención al cliente</w:t>
+            </w:pPr>
+            <w:r>
+              <w:rPr>
+                <w:b/>
+                <w:bCs/>
+                <w:lang w:val="es-419"/>
+              </w:rPr>
+              <w:t>Transcripción</w:t>
+            </w:r>
+            <w:r>
+              <w:rPr>
+                <w:b/>
+                <w:bCs/>
+                <w:lang w:val="es-419"/>
+              </w:rPr>
+              <w:t xml:space="preserve"> del video</w:t>
+            </w:r>
+            <w:r>
+              <w:rPr>
+                <w:b/>
+                <w:bCs/>
+                <w:lang w:val="es-419"/>
+              </w:rPr>
+              <w:t>. C</w:t>
+            </w:r>
+            <w:r>
+              <w:rPr>
+                <w:b/>
+                <w:bCs/>
+                <w:lang w:val="es-419"/>
+              </w:rPr>
+              <w:t>aracterísticas de un sistema eficaz de atención al cliente</w:t>
             </w:r>
           </w:p>
         </w:tc>
@@ -3203,17 +3203,17 @@
               <w:t>y</w:t>
             </w:r>
             <w:r>
-              <w:t xml:space="preserve"> o viaje del cliente, en el que se analiza cómo el cliente toma su decisión de compra de acuerdo con la comparación que haga con otros productos que se ofrecen en la </w:t>
+              <w:t xml:space="preserve"> o viaje del cliente, en el que se analiza cómo el cliente toma su decisión de compra de acuerdo con la </w:t>
+            </w:r>
+            <w:r>
+              <w:lastRenderedPageBreak/>
+              <w:t xml:space="preserve">comparación que haga con otros productos que se ofrecen en la </w:t>
             </w:r>
             <w:r>
               <w:t>web</w:t>
             </w:r>
             <w:r>
-              <w:t xml:space="preserve">. Por tanto, si </w:t>
-            </w:r>
-            <w:r>
-              <w:lastRenderedPageBreak/>
-              <w:t>una empresa logra dar una respuesta y acompañar a su cliente potencial de forma más rápida y eficaz, tendrá la posibilidad de que este compre sus productos o servicios.</w:t>
+              <w:t>. Por tanto, si una empresa logra dar una respuesta y acompañar a su cliente potencial de forma más rápida y eficaz, tendrá la posibilidad de que este compre sus productos o servicios.</w:t>
             </w:r>
           </w:p>
           <w:p>
@@ -3286,7 +3286,7 @@
               <w:t>, e</w:t>
             </w:r>
             <w:r>
-              <w:t>s ideal establecer distintas secciones para la atención al cliente que garanticen que se cuenta con personal especializado en cada una de ellas, según las necesidades del cliente, pues una queja no tiene la misma prioridad que una solicitud de información.</w:t>
+              <w:t>s ideal establecer distintas secciones para la atención al cliente que garantice que se cuenta con personal especializado en cada una de ellas, según las necesidades del cliente, pues una queja no tiene la misma prioridad que una solicitud de información.</w:t>
             </w:r>
             <w:r>
               <w:t xml:space="preserve"> </w:t>
@@ -3351,6 +3351,7 @@
         <w:rPr>
           <w:lang w:val="es-419" w:eastAsia="es-CO"/>
         </w:rPr>
+        <w:lastRenderedPageBreak/>
         <w:br w:type="page"/>
       </w:r>
     </w:p>
@@ -3432,6 +3433,7 @@
           <w:lang w:val="es-419" w:eastAsia="es-CO"/>
         </w:rPr>
       </w:pPr>
+      <w:proofErr w:type="spellStart"/>
       <w:r>
         <w:rPr>
           <w:rStyle w:val="Extranjerismo"/>
@@ -3441,6 +3443,7 @@
         </w:rPr>
         <w:t>Livechat</w:t>
       </w:r>
+      <w:proofErr w:type="spellEnd"/>
       <w:r>
         <w:rPr>
           <w:b/>
@@ -3449,6 +3452,7 @@
         </w:rPr>
         <w:t xml:space="preserve"> y </w:t>
       </w:r>
+      <w:proofErr w:type="spellStart"/>
       <w:r>
         <w:rPr>
           <w:rStyle w:val="Extranjerismo"/>
@@ -3458,6 +3462,7 @@
         </w:rPr>
         <w:t>chatbot</w:t>
       </w:r>
+      <w:proofErr w:type="spellEnd"/>
     </w:p>
     <w:p>
       <w:pPr>
@@ -3587,7 +3592,7 @@
           <w:noProof/>
         </w:rPr>
         <w:drawing>
-          <wp:inline distT="0" distB="0" distL="0" distR="0" wp14:anchorId="6CDC54FF" wp14:editId="7405B82E">
+          <wp:inline distT="0" distB="0" distL="0" distR="0" wp14:anchorId="6CDC54FF" wp14:editId="1C44637C">
             <wp:extent cx="4496873" cy="2529491"/>
             <wp:effectExtent l="0" t="0" r="0" b="4445"/>
             <wp:docPr id="572698455" name="Imagen 6">
@@ -4548,7 +4553,7 @@
           <w:noProof/>
         </w:rPr>
         <w:drawing>
-          <wp:inline distT="0" distB="0" distL="0" distR="0" wp14:anchorId="01842580" wp14:editId="29B085B2">
+          <wp:inline distT="0" distB="0" distL="0" distR="0" wp14:anchorId="01842580" wp14:editId="4C0CA5E0">
             <wp:extent cx="4812083" cy="2706796"/>
             <wp:effectExtent l="0" t="0" r="7620" b="0"/>
             <wp:docPr id="1542056856" name="Imagen 13">
@@ -6604,7 +6609,35 @@
               <w:rPr>
                 <w:lang w:val="es-419" w:eastAsia="es-CO"/>
               </w:rPr>
-              <w:t>Recaudo electrónico: diferentes canales como Efecty, Nequi, Daviplata, etc.</w:t>
+              <w:t xml:space="preserve">Recaudo electrónico: diferentes canales como Efecty, </w:t>
+            </w:r>
+            <w:proofErr w:type="spellStart"/>
+            <w:r>
+              <w:rPr>
+                <w:lang w:val="es-419" w:eastAsia="es-CO"/>
+              </w:rPr>
+              <w:t>Nequi</w:t>
+            </w:r>
+            <w:proofErr w:type="spellEnd"/>
+            <w:r>
+              <w:rPr>
+                <w:lang w:val="es-419" w:eastAsia="es-CO"/>
+              </w:rPr>
+              <w:t xml:space="preserve">, </w:t>
+            </w:r>
+            <w:proofErr w:type="spellStart"/>
+            <w:r>
+              <w:rPr>
+                <w:lang w:val="es-419" w:eastAsia="es-CO"/>
+              </w:rPr>
+              <w:t>Daviplata</w:t>
+            </w:r>
+            <w:proofErr w:type="spellEnd"/>
+            <w:r>
+              <w:rPr>
+                <w:lang w:val="es-419" w:eastAsia="es-CO"/>
+              </w:rPr>
+              <w:t>, etc.</w:t>
             </w:r>
           </w:p>
         </w:tc>
@@ -8464,6 +8497,7 @@
         <w:lastRenderedPageBreak/>
         <w:t xml:space="preserve">Notificaciones </w:t>
       </w:r>
+      <w:proofErr w:type="spellStart"/>
       <w:r>
         <w:rPr>
           <w:rStyle w:val="Extranjerismo"/>
@@ -8471,6 +8505,7 @@
         </w:rPr>
         <w:t>push</w:t>
       </w:r>
+      <w:proofErr w:type="spellEnd"/>
       <w:r>
         <w:rPr>
           <w:lang w:val="es-419" w:eastAsia="es-CO"/>
@@ -8835,8 +8870,18 @@
           <w:lang w:val="es-419" w:eastAsia="es-CO"/>
         </w:rPr>
         <w:lastRenderedPageBreak/>
-        <w:t>Barreras sociográficas</w:t>
-      </w:r>
+        <w:t xml:space="preserve">Barreras </w:t>
+      </w:r>
+      <w:proofErr w:type="spellStart"/>
+      <w:r>
+        <w:rPr>
+          <w:b/>
+          <w:bCs/>
+          <w:lang w:val="es-419" w:eastAsia="es-CO"/>
+        </w:rPr>
+        <w:t>sociográficas</w:t>
+      </w:r>
+      <w:proofErr w:type="spellEnd"/>
     </w:p>
     <w:p>
       <w:pPr>
@@ -9129,12 +9174,21 @@
         </w:rPr>
         <w:t xml:space="preserve">En la jerarquización de la comunicación con los clientes juegan un papel fundamental los representantes de servicio al cliente, los agentes de los </w:t>
       </w:r>
+      <w:proofErr w:type="spellStart"/>
       <w:r>
         <w:rPr>
           <w:rStyle w:val="Extranjerismo"/>
           <w:lang w:val="es-419" w:eastAsia="es-CO"/>
         </w:rPr>
-        <w:t>call center</w:t>
+        <w:t>call</w:t>
+      </w:r>
+      <w:proofErr w:type="spellEnd"/>
+      <w:r>
+        <w:rPr>
+          <w:rStyle w:val="Extranjerismo"/>
+          <w:lang w:val="es-419" w:eastAsia="es-CO"/>
+        </w:rPr>
+        <w:t xml:space="preserve"> center</w:t>
       </w:r>
       <w:r>
         <w:rPr>
@@ -9311,12 +9365,21 @@
         </w:rPr>
         <w:t>Los funcionarios del centro de llamadas (</w:t>
       </w:r>
+      <w:proofErr w:type="spellStart"/>
       <w:r>
         <w:rPr>
           <w:rStyle w:val="Extranjerismo"/>
           <w:lang w:val="es-419" w:eastAsia="es-CO"/>
         </w:rPr>
-        <w:t>call center</w:t>
+        <w:t>call</w:t>
+      </w:r>
+      <w:proofErr w:type="spellEnd"/>
+      <w:r>
+        <w:rPr>
+          <w:rStyle w:val="Extranjerismo"/>
+          <w:lang w:val="es-419" w:eastAsia="es-CO"/>
+        </w:rPr>
+        <w:t xml:space="preserve"> center</w:t>
       </w:r>
       <w:r>
         <w:rPr>
@@ -9456,7 +9519,19 @@
         <w:rPr>
           <w:lang w:val="es-419" w:eastAsia="es-CO"/>
         </w:rPr>
-        <w:t>A continuación, se muestran las técnicas de comunicación con sus objetivos y estrategias:</w:t>
+        <w:t xml:space="preserve">A continuación, se </w:t>
+      </w:r>
+      <w:r>
+        <w:rPr>
+          <w:lang w:val="es-419" w:eastAsia="es-CO"/>
+        </w:rPr>
+        <w:t>describen</w:t>
+      </w:r>
+      <w:r>
+        <w:rPr>
+          <w:lang w:val="es-419" w:eastAsia="es-CO"/>
+        </w:rPr>
+        <w:t xml:space="preserve"> las técnicas de comunicación con sus objetivos y estrategias:</w:t>
       </w:r>
     </w:p>
     <w:p>
@@ -9870,7 +9945,21 @@
               <w:rPr>
                 <w:lang w:val="es-419" w:eastAsia="es-CO"/>
               </w:rPr>
-              <w:t xml:space="preserve">La cara es la parte de nuestro cuerpo que presenta mayor gestualización, a la hora de atender al cliente se debe ser muy cuidadoso evitando hacer gestos </w:t>
+              <w:t xml:space="preserve">La cara es la parte de nuestro cuerpo que presenta mayor </w:t>
+            </w:r>
+            <w:proofErr w:type="spellStart"/>
+            <w:r>
+              <w:rPr>
+                <w:lang w:val="es-419" w:eastAsia="es-CO"/>
+              </w:rPr>
+              <w:t>gestualización</w:t>
+            </w:r>
+            <w:proofErr w:type="spellEnd"/>
+            <w:r>
+              <w:rPr>
+                <w:lang w:val="es-419" w:eastAsia="es-CO"/>
+              </w:rPr>
+              <w:t xml:space="preserve">, a la hora de atender al cliente se debe ser muy cuidadoso evitando hacer gestos </w:t>
             </w:r>
             <w:r>
               <w:rPr>
@@ -10511,7 +10600,7 @@
           <w:noProof/>
         </w:rPr>
         <w:drawing>
-          <wp:inline distT="0" distB="0" distL="0" distR="0" wp14:anchorId="0FD6810D" wp14:editId="68DAB722">
+          <wp:inline distT="0" distB="0" distL="0" distR="0" wp14:anchorId="0FD6810D" wp14:editId="429AE9EB">
             <wp:extent cx="4285674" cy="2410691"/>
             <wp:effectExtent l="0" t="0" r="635" b="8890"/>
             <wp:docPr id="1468736784" name="Imagen 9">
@@ -11538,13 +11627,31 @@
         </w:rPr>
         <w:t xml:space="preserve"> de </w:t>
       </w:r>
+      <w:proofErr w:type="spellStart"/>
       <w:r>
         <w:rPr>
           <w:rStyle w:val="Extranjerismo"/>
           <w:lang w:val="es-419" w:eastAsia="es-CO"/>
         </w:rPr>
-        <w:t>Customer Relationship</w:t>
-      </w:r>
+        <w:t>Customer</w:t>
+      </w:r>
+      <w:proofErr w:type="spellEnd"/>
+      <w:r>
+        <w:rPr>
+          <w:rStyle w:val="Extranjerismo"/>
+          <w:lang w:val="es-419" w:eastAsia="es-CO"/>
+        </w:rPr>
+        <w:t xml:space="preserve"> </w:t>
+      </w:r>
+      <w:proofErr w:type="spellStart"/>
+      <w:r>
+        <w:rPr>
+          <w:rStyle w:val="Extranjerismo"/>
+          <w:lang w:val="es-419" w:eastAsia="es-CO"/>
+        </w:rPr>
+        <w:t>Relationship</w:t>
+      </w:r>
+      <w:proofErr w:type="spellEnd"/>
       <w:r>
         <w:rPr>
           <w:lang w:val="es-419" w:eastAsia="es-CO"/>
@@ -11682,6 +11789,7 @@
         <w:lastRenderedPageBreak/>
         <w:t xml:space="preserve">en el momento que lo requiera, estos centros de ayuda son los </w:t>
       </w:r>
+      <w:proofErr w:type="spellStart"/>
       <w:r>
         <w:rPr>
           <w:rStyle w:val="Extranjerismo"/>
@@ -11689,6 +11797,7 @@
         </w:rPr>
         <w:t>chatbots</w:t>
       </w:r>
+      <w:proofErr w:type="spellEnd"/>
       <w:r>
         <w:rPr>
           <w:lang w:val="es-419" w:eastAsia="es-CO"/>
@@ -12435,7 +12544,15 @@
     </w:p>
     <w:p>
       <w:r>
-        <w:t>Cajal, F., A. (2020). Portafolio de servicios: tipos, partes y ejemplos. Lifeder.</w:t>
+        <w:t xml:space="preserve">Cajal, F., A. (2020). Portafolio de servicios: tipos, partes y ejemplos. </w:t>
+      </w:r>
+      <w:proofErr w:type="spellStart"/>
+      <w:r>
+        <w:t>Lifeder</w:t>
+      </w:r>
+      <w:proofErr w:type="spellEnd"/>
+      <w:r>
+        <w:t>.</w:t>
       </w:r>
     </w:p>
     <w:p>
@@ -12576,14 +12693,27 @@
       </w:r>
     </w:p>
     <w:p>
-      <w:r>
-        <w:t xml:space="preserve">Models, Inc., </w:t>
+      <w:proofErr w:type="spellStart"/>
+      <w:r>
+        <w:t>Models</w:t>
+      </w:r>
+      <w:proofErr w:type="spellEnd"/>
+      <w:r>
+        <w:t xml:space="preserve">, Inc., </w:t>
       </w:r>
       <w:r>
         <w:t>y</w:t>
       </w:r>
       <w:r>
-        <w:t xml:space="preserve"> Communication. (2011). </w:t>
+        <w:t xml:space="preserve"> </w:t>
+      </w:r>
+      <w:proofErr w:type="spellStart"/>
+      <w:r>
+        <w:t>Communication</w:t>
+      </w:r>
+      <w:proofErr w:type="spellEnd"/>
+      <w:r>
+        <w:t xml:space="preserve">. (2011). </w:t>
       </w:r>
       <w:r>
         <w:rPr>
@@ -13511,8 +13641,17 @@
                 <w:szCs w:val="24"/>
               </w:rPr>
               <w:lastRenderedPageBreak/>
-              <w:t>Gilberto Junior Rodríguez Rodríguez</w:t>
-            </w:r>
+              <w:t xml:space="preserve">Gilberto Junior Rodríguez </w:t>
+            </w:r>
+            <w:proofErr w:type="spellStart"/>
+            <w:r>
+              <w:rPr>
+                <w:rFonts w:cs="Calibri"/>
+                <w:szCs w:val="24"/>
+              </w:rPr>
+              <w:t>Rodríguez</w:t>
+            </w:r>
+            <w:proofErr w:type="spellEnd"/>
           </w:p>
         </w:tc>
         <w:tc>
@@ -13672,8 +13811,17 @@
                 <w:rFonts w:cs="Calibri"/>
                 <w:szCs w:val="24"/>
               </w:rPr>
-              <w:t>Ernesto Navarro Jaimes</w:t>
-            </w:r>
+              <w:t xml:space="preserve">Ernesto Navarro </w:t>
+            </w:r>
+            <w:proofErr w:type="spellStart"/>
+            <w:r>
+              <w:rPr>
+                <w:rFonts w:cs="Calibri"/>
+                <w:szCs w:val="24"/>
+              </w:rPr>
+              <w:t>Jaimes</w:t>
+            </w:r>
+            <w:proofErr w:type="spellEnd"/>
           </w:p>
         </w:tc>
         <w:tc>
@@ -13828,12 +13976,21 @@
                 <w:szCs w:val="24"/>
               </w:rPr>
             </w:pPr>
+            <w:proofErr w:type="spellStart"/>
             <w:r>
               <w:rPr>
                 <w:rFonts w:cs="Calibri"/>
                 <w:szCs w:val="24"/>
               </w:rPr>
-              <w:t>Yicelly Estefania Mesa Silva</w:t>
+              <w:t>Yicelly</w:t>
+            </w:r>
+            <w:proofErr w:type="spellEnd"/>
+            <w:r>
+              <w:rPr>
+                <w:rFonts w:cs="Calibri"/>
+                <w:szCs w:val="24"/>
+              </w:rPr>
+              <w:t xml:space="preserve"> Estefania Mesa Silva</w:t>
             </w:r>
           </w:p>
         </w:tc>
@@ -13921,12 +14078,21 @@
                 <w:szCs w:val="24"/>
               </w:rPr>
             </w:pPr>
+            <w:proofErr w:type="spellStart"/>
             <w:r>
               <w:rPr>
                 <w:rFonts w:cs="Calibri"/>
                 <w:szCs w:val="24"/>
               </w:rPr>
-              <w:t>Ludwyng Corzo García</w:t>
+              <w:t>Ludwyng</w:t>
+            </w:r>
+            <w:proofErr w:type="spellEnd"/>
+            <w:r>
+              <w:rPr>
+                <w:rFonts w:cs="Calibri"/>
+                <w:szCs w:val="24"/>
+              </w:rPr>
+              <w:t xml:space="preserve"> Corzo García</w:t>
             </w:r>
           </w:p>
         </w:tc>
@@ -21078,8 +21244,8 @@
   <ds:schemaRefs>
     <ds:schemaRef ds:uri="http://schemas.microsoft.com/office/2006/metadata/properties"/>
     <ds:schemaRef ds:uri="http://schemas.microsoft.com/office/infopath/2007/PartnerControls"/>
-    <ds:schemaRef ds:uri="adccf511-daff-4bcb-9072-914cedbf4c7e"/>
-    <ds:schemaRef ds:uri="a70d3c18-0869-45a1-9f75-4b4b8f0f32be"/>
+    <ds:schemaRef ds:uri="13c90a0b-73bc-4dc0-be5f-28d77b615beb"/>
+    <ds:schemaRef ds:uri="13c93bba-48ce-428c-bfe5-88b42c19b028"/>
   </ds:schemaRefs>
 </ds:datastoreItem>
 </file>
@@ -21093,7 +21259,22 @@
 </file>
 
 <file path=customXml/itemProps3.xml><?xml version="1.0" encoding="utf-8"?>
-<ds:datastoreItem xmlns:ds="http://schemas.openxmlformats.org/officeDocument/2006/customXml" ds:itemID="{69316E0F-E682-4C64-B95C-F146952F8454}"/>
+<ds:datastoreItem xmlns:ds="http://schemas.openxmlformats.org/officeDocument/2006/customXml" ds:itemID="{FA1B781A-F25A-4A2C-9D8D-BDD73F50B939}">
+  <ds:schemaRefs>
+    <ds:schemaRef ds:uri="http://schemas.microsoft.com/office/2006/metadata/contentType"/>
+    <ds:schemaRef ds:uri="http://schemas.microsoft.com/office/2006/metadata/properties/metaAttributes"/>
+    <ds:schemaRef ds:uri="http://www.w3.org/2001/XMLSchema"/>
+    <ds:schemaRef ds:uri="http://schemas.microsoft.com/office/2006/metadata/properties"/>
+    <ds:schemaRef ds:uri="13c90a0b-73bc-4dc0-be5f-28d77b615beb"/>
+    <ds:schemaRef ds:uri="13c93bba-48ce-428c-bfe5-88b42c19b028"/>
+    <ds:schemaRef ds:uri="http://schemas.microsoft.com/office/2006/documentManagement/types"/>
+    <ds:schemaRef ds:uri="http://schemas.microsoft.com/office/infopath/2007/PartnerControls"/>
+    <ds:schemaRef ds:uri="http://schemas.openxmlformats.org/package/2006/metadata/core-properties"/>
+    <ds:schemaRef ds:uri="http://purl.org/dc/elements/1.1/"/>
+    <ds:schemaRef ds:uri="http://purl.org/dc/terms/"/>
+    <ds:schemaRef ds:uri="http://schemas.microsoft.com/internal/obd"/>
+  </ds:schemaRefs>
+</ds:datastoreItem>
 </file>
 
 <file path=customXml/itemProps4.xml><?xml version="1.0" encoding="utf-8"?>

</xml_diff>